<commit_message>
Blanko-Vorlage: Confirming-Zeile wird nicht mehr abgeschnitten, Labels fett
Co-Authored-By: Claude Opus 5.5 <noreply@anthropic.com>
</commit_message>
<xml_diff>
--- a/QSL_Blanko.docx
+++ b/QSL_Blanko.docx
@@ -231,6 +231,8 @@
             <w:r>
               <w:rPr>
                 <w:rFonts w:ascii="Avenir Next Condensed" w:hAnsi="Avenir Next Condensed" w:cs="Avenir Next Condensed"/>
+                <w:b/>
+                <w:bCs/>
                 <w:noProof/>
                 <w:color w:val="595959"/>
                 <w:sz w:val="14"/>
@@ -667,26 +669,12 @@
     </w:tbl>
     <w:p>
       <w:pPr>
-        <w:spacing w:after="0" w:line="250" w:lineRule="exact"/>
+        <w:spacing w:before="0" w:after="0" w:line="20" w:lineRule="exact"/>
         <w:rPr>
-          <w:rFonts w:ascii="Avenir Next Condensed" w:hAnsi="Avenir Next Condensed" w:cs="Avenir Next Condensed"/>
-          <w:noProof/>
-          <w:color w:val="000000"/>
-          <w:sz w:val="14"/>
-          <w:szCs w:val="14"/>
+          <w:sz w:val="2"/>
+          <w:szCs w:val="2"/>
         </w:rPr>
       </w:pPr>
-      <w:r>
-        <w:rPr>
-          <w:rFonts w:ascii="Avenir Next Condensed" w:hAnsi="Avenir Next Condensed" w:cs="Avenir Next Condensed"/>
-          <w:caps/>
-          <w:noProof/>
-          <w:color w:val="595959"/>
-          <w:sz w:val="14"/>
-          <w:szCs w:val="14"/>
-        </w:rPr>
-        <w:t>Confirming our 2-way QSO</w:t>
-      </w:r>
     </w:p>
     <w:tbl>
       <w:tblPr>
@@ -706,6 +694,46 @@
         <w:gridCol w:w="1000"/>
         <w:gridCol w:w="1300"/>
       </w:tblGrid>
+      <w:tr>
+        <w:trPr>
+          <w:cantSplit/>
+          <w:trHeight w:hRule="exact" w:val="230"/>
+        </w:trPr>
+        <w:tc>
+          <w:tcPr>
+            <w:tcW w:w="7320" w:type="dxa"/>
+            <w:gridSpan w:val="6"/>
+            <w:tcBorders>
+              <w:top w:val="nil"/>
+              <w:left w:val="nil"/>
+              <w:right w:val="nil"/>
+            </w:tcBorders>
+            <w:tcMar>
+              <w:left w:w="0" w:type="dxa"/>
+              <w:right w:w="0" w:type="dxa"/>
+            </w:tcMar>
+            <w:vAlign w:val="center"/>
+          </w:tcPr>
+          <w:p>
+            <w:pPr>
+              <w:spacing w:before="0" w:after="0" w:line="180" w:lineRule="exact"/>
+            </w:pPr>
+            <w:r>
+              <w:rPr>
+                <w:rFonts w:ascii="Avenir Next Condensed" w:hAnsi="Avenir Next Condensed" w:cs="Avenir Next Condensed"/>
+                <w:b/>
+                <w:bCs/>
+                <w:caps/>
+                <w:noProof/>
+                <w:color w:val="595959"/>
+                <w:sz w:val="14"/>
+                <w:szCs w:val="14"/>
+              </w:rPr>
+              <w:t>Confirming our 2-way QSO</w:t>
+            </w:r>
+          </w:p>
+        </w:tc>
+      </w:tr>
       <w:tr>
         <w:trPr>
           <w:cantSplit/>

</xml_diff>